<commit_message>
Docs: Embed SHAP figures in the interim report
Add the two pipeline-generated SHAP summary plots (local 8-construct model
and cross-cultural transfer model) as Figures 1-2 in Chapter 5, with
auto-numbered captions. Placeholders are wired for four UI screenshots
(created_docs/figures/) that activate when the images are added.
</commit_message>
<xml_diff>
--- a/created_docs/Interim_Report_COM4901_Theekshana_Gimhan.docx
+++ b/created_docs/Interim_Report_COM4901_Theekshana_Gimhan.docx
@@ -2152,6 +2152,60 @@
     </w:p>
     <w:p>
       <w:pPr>
+        <w:spacing w:after="40"/>
+        <w:jc w:val="center"/>
+      </w:pPr>
+      <w:r>
+        <w:drawing>
+          <wp:inline xmlns:a="http://schemas.openxmlformats.org/drawingml/2006/main" xmlns:pic="http://schemas.openxmlformats.org/drawingml/2006/picture">
+            <wp:extent cx="5120640" cy="3008376"/>
+            <wp:docPr id="1" name="Picture 1"/>
+            <wp:cNvGraphicFramePr>
+              <a:graphicFrameLocks noChangeAspect="1"/>
+            </wp:cNvGraphicFramePr>
+            <a:graphic>
+              <a:graphicData uri="http://schemas.openxmlformats.org/drawingml/2006/picture">
+                <pic:pic>
+                  <pic:nvPicPr>
+                    <pic:cNvPr id="0" name="shap_local.png"/>
+                    <pic:cNvPicPr/>
+                  </pic:nvPicPr>
+                  <pic:blipFill>
+                    <a:blip r:embed="rId9"/>
+                    <a:stretch>
+                      <a:fillRect/>
+                    </a:stretch>
+                  </pic:blipFill>
+                  <pic:spPr>
+                    <a:xfrm>
+                      <a:off x="0" y="0"/>
+                      <a:ext cx="5120640" cy="3008376"/>
+                    </a:xfrm>
+                    <a:prstGeom prst="rect"/>
+                  </pic:spPr>
+                </pic:pic>
+              </a:graphicData>
+            </a:graphic>
+          </wp:inline>
+        </w:drawing>
+      </w:r>
+    </w:p>
+    <w:p>
+      <w:pPr>
+        <w:spacing w:after="200"/>
+        <w:jc w:val="center"/>
+      </w:pPr>
+      <w:r>
+        <w:rPr>
+          <w:rFonts w:ascii="Times New Roman" w:hAnsi="Times New Roman"/>
+          <w:i/>
+          <w:sz w:val="20"/>
+        </w:rPr>
+        <w:t>Figure 1: SHAP summary (beeswarm) for the local model. Each point is one respondent; position shows the construct's contribution to predicted flight-risk intention, colour shows the construct value (blue = low, red = high). Lower work-life balance, co-worker support, and job satisfaction push risk upward, as expected.</w:t>
+      </w:r>
+    </w:p>
+    <w:p>
+      <w:pPr>
         <w:pStyle w:val="Heading2"/>
       </w:pPr>
       <w:r>
@@ -2282,6 +2336,60 @@
           <w:sz w:val="24"/>
         </w:rPr>
         <w:t>international training prevalence (~42%) differs from the Sri Lankan rate (14.3%); thresholds are tuned on a held-out split and the full metric suite is reported at each operating point.</w:t>
+      </w:r>
+    </w:p>
+    <w:p>
+      <w:pPr>
+        <w:spacing w:after="40"/>
+        <w:jc w:val="center"/>
+      </w:pPr>
+      <w:r>
+        <w:drawing>
+          <wp:inline xmlns:a="http://schemas.openxmlformats.org/drawingml/2006/main" xmlns:pic="http://schemas.openxmlformats.org/drawingml/2006/picture">
+            <wp:extent cx="5120640" cy="1984248"/>
+            <wp:docPr id="2" name="Picture 2"/>
+            <wp:cNvGraphicFramePr>
+              <a:graphicFrameLocks noChangeAspect="1"/>
+            </wp:cNvGraphicFramePr>
+            <a:graphic>
+              <a:graphicData uri="http://schemas.openxmlformats.org/drawingml/2006/picture">
+                <pic:pic>
+                  <pic:nvPicPr>
+                    <pic:cNvPr id="0" name="shap_summary.png"/>
+                    <pic:cNvPicPr/>
+                  </pic:nvPicPr>
+                  <pic:blipFill>
+                    <a:blip r:embed="rId10"/>
+                    <a:stretch>
+                      <a:fillRect/>
+                    </a:stretch>
+                  </pic:blipFill>
+                  <pic:spPr>
+                    <a:xfrm>
+                      <a:off x="0" y="0"/>
+                      <a:ext cx="5120640" cy="1984248"/>
+                    </a:xfrm>
+                    <a:prstGeom prst="rect"/>
+                  </pic:spPr>
+                </pic:pic>
+              </a:graphicData>
+            </a:graphic>
+          </wp:inline>
+        </w:drawing>
+      </w:r>
+    </w:p>
+    <w:p>
+      <w:pPr>
+        <w:spacing w:after="200"/>
+        <w:jc w:val="center"/>
+      </w:pPr>
+      <w:r>
+        <w:rPr>
+          <w:rFonts w:ascii="Times New Roman" w:hAnsi="Times New Roman"/>
+          <w:i/>
+          <w:sz w:val="20"/>
+        </w:rPr>
+        <w:t>Figure 2: SHAP summary for the cross-cultural transfer model. With only the four internationally-shared features, the model leans heavily on Age, illustrating why transfer alone is a weak basis for Sri Lankan attrition prediction.</w:t>
       </w:r>
     </w:p>
     <w:p>

</xml_diff>

<commit_message>
Docs: Add UI screenshots to the interim report
Embed four screenshots of the deployed system (management dashboard,
Attrition Risk what-if card, weekly Pulse Check, manager Pulse-derived
risk card) as Figures 1-4; the SHAP plots become Figures 5-6. Captions
corrected to match each image (the attrition card shows the input/what-if
form, not a result). Report now carries 6 figures and 5 tables.
</commit_message>
<xml_diff>
--- a/created_docs/Interim_Report_COM4901_Theekshana_Gimhan.docx
+++ b/created_docs/Interim_Report_COM4901_Theekshana_Gimhan.docx
@@ -1752,6 +1752,60 @@
     </w:p>
     <w:p>
       <w:pPr>
+        <w:spacing w:after="40"/>
+        <w:jc w:val="center"/>
+      </w:pPr>
+      <w:r>
+        <w:drawing>
+          <wp:inline xmlns:a="http://schemas.openxmlformats.org/drawingml/2006/main" xmlns:pic="http://schemas.openxmlformats.org/drawingml/2006/picture">
+            <wp:extent cx="5486400" cy="2523049"/>
+            <wp:docPr id="1" name="Picture 1"/>
+            <wp:cNvGraphicFramePr>
+              <a:graphicFrameLocks noChangeAspect="1"/>
+            </wp:cNvGraphicFramePr>
+            <a:graphic>
+              <a:graphicData uri="http://schemas.openxmlformats.org/drawingml/2006/picture">
+                <pic:pic>
+                  <pic:nvPicPr>
+                    <pic:cNvPr id="0" name="dashboard.png"/>
+                    <pic:cNvPicPr/>
+                  </pic:nvPicPr>
+                  <pic:blipFill>
+                    <a:blip r:embed="rId9"/>
+                    <a:stretch>
+                      <a:fillRect/>
+                    </a:stretch>
+                  </pic:blipFill>
+                  <pic:spPr>
+                    <a:xfrm>
+                      <a:off x="0" y="0"/>
+                      <a:ext cx="5486400" cy="2523049"/>
+                    </a:xfrm>
+                    <a:prstGeom prst="rect"/>
+                  </pic:spPr>
+                </pic:pic>
+              </a:graphicData>
+            </a:graphic>
+          </wp:inline>
+        </w:drawing>
+      </w:r>
+    </w:p>
+    <w:p>
+      <w:pPr>
+        <w:spacing w:after="200"/>
+        <w:jc w:val="center"/>
+      </w:pPr>
+      <w:r>
+        <w:rPr>
+          <w:rFonts w:ascii="Times New Roman" w:hAnsi="Times New Roman"/>
+          <w:i/>
+          <w:sz w:val="20"/>
+        </w:rPr>
+        <w:t>Figure 1: The NexusHR / Simpala HR management dashboard, deployed on Google Cloud Run.</w:t>
+      </w:r>
+    </w:p>
+    <w:p>
+      <w:pPr>
         <w:pStyle w:val="Heading2"/>
       </w:pPr>
       <w:r>
@@ -1802,6 +1856,60 @@
     </w:p>
     <w:p>
       <w:pPr>
+        <w:spacing w:after="40"/>
+        <w:jc w:val="center"/>
+      </w:pPr>
+      <w:r>
+        <w:drawing>
+          <wp:inline xmlns:a="http://schemas.openxmlformats.org/drawingml/2006/main" xmlns:pic="http://schemas.openxmlformats.org/drawingml/2006/picture">
+            <wp:extent cx="4389120" cy="3624887"/>
+            <wp:docPr id="2" name="Picture 2"/>
+            <wp:cNvGraphicFramePr>
+              <a:graphicFrameLocks noChangeAspect="1"/>
+            </wp:cNvGraphicFramePr>
+            <a:graphic>
+              <a:graphicData uri="http://schemas.openxmlformats.org/drawingml/2006/picture">
+                <pic:pic>
+                  <pic:nvPicPr>
+                    <pic:cNvPr id="0" name="attrition_risk_card.png"/>
+                    <pic:cNvPicPr/>
+                  </pic:nvPicPr>
+                  <pic:blipFill>
+                    <a:blip r:embed="rId10"/>
+                    <a:stretch>
+                      <a:fillRect/>
+                    </a:stretch>
+                  </pic:blipFill>
+                  <pic:spPr>
+                    <a:xfrm>
+                      <a:off x="0" y="0"/>
+                      <a:ext cx="4389120" cy="3624887"/>
+                    </a:xfrm>
+                    <a:prstGeom prst="rect"/>
+                  </pic:spPr>
+                </pic:pic>
+              </a:graphicData>
+            </a:graphic>
+          </wp:inline>
+        </w:drawing>
+      </w:r>
+    </w:p>
+    <w:p>
+      <w:pPr>
+        <w:spacing w:after="200"/>
+        <w:jc w:val="center"/>
+      </w:pPr>
+      <w:r>
+        <w:rPr>
+          <w:rFonts w:ascii="Times New Roman" w:hAnsi="Times New Roman"/>
+          <w:i/>
+          <w:sz w:val="20"/>
+        </w:rPr>
+        <w:t>Figure 2: The Attrition Risk card on the employee detail page (manual what-if mode): an authorised manager enters the eight sentiment constructs (1-5) and requests an on-demand prediction. Its automated counterpart, driven by the weekly Pulse Check, is shown in Figure 4.</w:t>
+      </w:r>
+    </w:p>
+    <w:p>
+      <w:pPr>
         <w:pStyle w:val="Heading2"/>
       </w:pPr>
       <w:r>
@@ -1823,6 +1931,114 @@
           <w:sz w:val="24"/>
         </w:rPr>
         <w:t>The strongest model consumes eight psychometric constructs whose natural production source is an employee survey rather than operational HR records. To supply these automatically and at low cost, a lightweight in-application weekly Pulse Check has been implemented and deployed: a 16-item Likert micro-survey (two items per construct) whose responses are averaged into the eight constructs using the same mean-of-items definition used in training, then scored against the inference service and stored once per employee per week. This was chosen in preference to a heavier conversational-AI agent specifically to preserve the cost objective. By design, employees see only a confirmation and never their own risk score; the resulting risk signal is visible to managers. Scoring is best-effort, so a model outage never blocks a submission.</w:t>
+      </w:r>
+    </w:p>
+    <w:p>
+      <w:pPr>
+        <w:spacing w:after="40"/>
+        <w:jc w:val="center"/>
+      </w:pPr>
+      <w:r>
+        <w:drawing>
+          <wp:inline xmlns:a="http://schemas.openxmlformats.org/drawingml/2006/main" xmlns:pic="http://schemas.openxmlformats.org/drawingml/2006/picture">
+            <wp:extent cx="4754880" cy="1945635"/>
+            <wp:docPr id="3" name="Picture 3"/>
+            <wp:cNvGraphicFramePr>
+              <a:graphicFrameLocks noChangeAspect="1"/>
+            </wp:cNvGraphicFramePr>
+            <a:graphic>
+              <a:graphicData uri="http://schemas.openxmlformats.org/drawingml/2006/picture">
+                <pic:pic>
+                  <pic:nvPicPr>
+                    <pic:cNvPr id="0" name="pulse_check_page.png"/>
+                    <pic:cNvPicPr/>
+                  </pic:nvPicPr>
+                  <pic:blipFill>
+                    <a:blip r:embed="rId11"/>
+                    <a:stretch>
+                      <a:fillRect/>
+                    </a:stretch>
+                  </pic:blipFill>
+                  <pic:spPr>
+                    <a:xfrm>
+                      <a:off x="0" y="0"/>
+                      <a:ext cx="4754880" cy="1945635"/>
+                    </a:xfrm>
+                    <a:prstGeom prst="rect"/>
+                  </pic:spPr>
+                </pic:pic>
+              </a:graphicData>
+            </a:graphic>
+          </wp:inline>
+        </w:drawing>
+      </w:r>
+    </w:p>
+    <w:p>
+      <w:pPr>
+        <w:spacing w:after="200"/>
+        <w:jc w:val="center"/>
+      </w:pPr>
+      <w:r>
+        <w:rPr>
+          <w:rFonts w:ascii="Times New Roman" w:hAnsi="Times New Roman"/>
+          <w:i/>
+          <w:sz w:val="20"/>
+        </w:rPr>
+        <w:t>Figure 3: The employee weekly Pulse Check: a 16-item Likert micro-survey that feeds the eight model constructs automatically.</w:t>
+      </w:r>
+    </w:p>
+    <w:p>
+      <w:pPr>
+        <w:spacing w:after="40"/>
+        <w:jc w:val="center"/>
+      </w:pPr>
+      <w:r>
+        <w:drawing>
+          <wp:inline xmlns:a="http://schemas.openxmlformats.org/drawingml/2006/main" xmlns:pic="http://schemas.openxmlformats.org/drawingml/2006/picture">
+            <wp:extent cx="4754880" cy="4381133"/>
+            <wp:docPr id="4" name="Picture 4"/>
+            <wp:cNvGraphicFramePr>
+              <a:graphicFrameLocks noChangeAspect="1"/>
+            </wp:cNvGraphicFramePr>
+            <a:graphic>
+              <a:graphicData uri="http://schemas.openxmlformats.org/drawingml/2006/picture">
+                <pic:pic>
+                  <pic:nvPicPr>
+                    <pic:cNvPr id="0" name="pulse_risk_card.png"/>
+                    <pic:cNvPicPr/>
+                  </pic:nvPicPr>
+                  <pic:blipFill>
+                    <a:blip r:embed="rId12"/>
+                    <a:stretch>
+                      <a:fillRect/>
+                    </a:stretch>
+                  </pic:blipFill>
+                  <pic:spPr>
+                    <a:xfrm>
+                      <a:off x="0" y="0"/>
+                      <a:ext cx="4754880" cy="4381133"/>
+                    </a:xfrm>
+                    <a:prstGeom prst="rect"/>
+                  </pic:spPr>
+                </pic:pic>
+              </a:graphicData>
+            </a:graphic>
+          </wp:inline>
+        </w:drawing>
+      </w:r>
+    </w:p>
+    <w:p>
+      <w:pPr>
+        <w:spacing w:after="200"/>
+        <w:jc w:val="center"/>
+      </w:pPr>
+      <w:r>
+        <w:rPr>
+          <w:rFonts w:ascii="Times New Roman" w:hAnsi="Times New Roman"/>
+          <w:i/>
+          <w:sz w:val="20"/>
+        </w:rPr>
+        <w:t>Figure 4: Manager view: the latest Pulse-derived attrition risk for an employee, on the employee detail page.</w:t>
       </w:r>
     </w:p>
     <w:p>
@@ -2159,7 +2375,7 @@
         <w:drawing>
           <wp:inline xmlns:a="http://schemas.openxmlformats.org/drawingml/2006/main" xmlns:pic="http://schemas.openxmlformats.org/drawingml/2006/picture">
             <wp:extent cx="5120640" cy="3008376"/>
-            <wp:docPr id="1" name="Picture 1"/>
+            <wp:docPr id="5" name="Picture 5"/>
             <wp:cNvGraphicFramePr>
               <a:graphicFrameLocks noChangeAspect="1"/>
             </wp:cNvGraphicFramePr>
@@ -2171,7 +2387,7 @@
                     <pic:cNvPicPr/>
                   </pic:nvPicPr>
                   <pic:blipFill>
-                    <a:blip r:embed="rId9"/>
+                    <a:blip r:embed="rId13"/>
                     <a:stretch>
                       <a:fillRect/>
                     </a:stretch>
@@ -2201,7 +2417,7 @@
           <w:i/>
           <w:sz w:val="20"/>
         </w:rPr>
-        <w:t>Figure 1: SHAP summary (beeswarm) for the local model. Each point is one respondent; position shows the construct's contribution to predicted flight-risk intention, colour shows the construct value (blue = low, red = high). Lower work-life balance, co-worker support, and job satisfaction push risk upward, as expected.</w:t>
+        <w:t>Figure 5: SHAP summary (beeswarm) for the local model. Each point is one respondent; position shows the construct's contribution to predicted flight-risk intention, colour shows the construct value (blue = low, red = high). Lower work-life balance, co-worker support, and job satisfaction push risk upward, as expected.</w:t>
       </w:r>
     </w:p>
     <w:p>
@@ -2347,7 +2563,7 @@
         <w:drawing>
           <wp:inline xmlns:a="http://schemas.openxmlformats.org/drawingml/2006/main" xmlns:pic="http://schemas.openxmlformats.org/drawingml/2006/picture">
             <wp:extent cx="5120640" cy="1984248"/>
-            <wp:docPr id="2" name="Picture 2"/>
+            <wp:docPr id="6" name="Picture 6"/>
             <wp:cNvGraphicFramePr>
               <a:graphicFrameLocks noChangeAspect="1"/>
             </wp:cNvGraphicFramePr>
@@ -2359,7 +2575,7 @@
                     <pic:cNvPicPr/>
                   </pic:nvPicPr>
                   <pic:blipFill>
-                    <a:blip r:embed="rId10"/>
+                    <a:blip r:embed="rId14"/>
                     <a:stretch>
                       <a:fillRect/>
                     </a:stretch>
@@ -2389,7 +2605,7 @@
           <w:i/>
           <w:sz w:val="20"/>
         </w:rPr>
-        <w:t>Figure 2: SHAP summary for the cross-cultural transfer model. With only the four internationally-shared features, the model leans heavily on Age, illustrating why transfer alone is a weak basis for Sri Lankan attrition prediction.</w:t>
+        <w:t>Figure 6: SHAP summary for the cross-cultural transfer model. With only the four internationally-shared features, the model leans heavily on Age, illustrating why transfer alone is a weak basis for Sri Lankan attrition prediction.</w:t>
       </w:r>
     </w:p>
     <w:p>

</xml_diff>